<commit_message>
Update Module 1 GitHub repository setup documentation
</commit_message>
<xml_diff>
--- a/module-1/Ddamulira GitHub Repository Setup.docx
+++ b/module-1/Ddamulira GitHub Repository Setup.docx
@@ -199,7 +199,59 @@
       </w:pPr>
     </w:p>
     <w:p>
+      <w:pPr>
+        <w:rPr>
+          <w:rFonts w:ascii="Arial" w:eastAsia="Times New Roman" w:hAnsi="Arial" w:cs="Arial"/>
+          <w:b/>
+          <w:bCs/>
+          <w:i/>
+          <w:iCs/>
+          <w:color w:val="000000"/>
+          <w:kern w:val="0"/>
+          <w:sz w:val="22"/>
+          <w:szCs w:val="22"/>
+          <w14:ligatures w14:val="none"/>
+        </w:rPr>
+      </w:pPr>
+      <w:hyperlink r:id="rId4" w:history="1">
+        <w:r>
+          <w:rPr>
+            <w:rStyle w:val="Hyperlink"/>
+            <w:rFonts w:ascii="Arial" w:eastAsia="Times New Roman" w:hAnsi="Arial" w:cs="Arial"/>
+            <w:b/>
+            <w:bCs/>
+            <w:i/>
+            <w:iCs/>
+            <w:kern w:val="0"/>
+            <w:sz w:val="22"/>
+            <w:szCs w:val="22"/>
+            <w14:ligatures w14:val="none"/>
+          </w:rPr>
+          <w:t>https://github.com/psddam/csd-340</w:t>
+        </w:r>
+      </w:hyperlink>
+    </w:p>
+    <w:p>
+      <w:pPr>
+        <w:rPr>
+          <w:rFonts w:ascii="Arial" w:eastAsia="Times New Roman" w:hAnsi="Arial" w:cs="Arial"/>
+          <w:b/>
+          <w:bCs/>
+          <w:i/>
+          <w:iCs/>
+          <w:color w:val="000000"/>
+          <w:kern w:val="0"/>
+          <w:sz w:val="22"/>
+          <w:szCs w:val="22"/>
+          <w14:ligatures w14:val="none"/>
+        </w:rPr>
+      </w:pPr>
+    </w:p>
+    <w:p>
       <w:r>
+        <w:rPr>
+          <w:noProof/>
+        </w:rPr>
         <w:drawing>
           <wp:inline distT="0" distB="0" distL="0" distR="0" wp14:anchorId="2E7DA713" wp14:editId="3CEE4B92">
             <wp:extent cx="5943600" cy="5102860"/>
@@ -216,7 +268,7 @@
                     <pic:cNvPicPr/>
                   </pic:nvPicPr>
                   <pic:blipFill>
-                    <a:blip r:embed="rId4"/>
+                    <a:blip r:embed="rId5"/>
                     <a:stretch>
                       <a:fillRect/>
                     </a:stretch>
@@ -234,6 +286,60 @@
               </a:graphicData>
             </a:graphic>
           </wp:inline>
+        </w:drawing>
+      </w:r>
+    </w:p>
+    <w:p>
+      <w:r>
+        <w:lastRenderedPageBreak/>
+        <w:drawing>
+          <wp:anchor distT="0" distB="0" distL="114300" distR="114300" simplePos="0" relativeHeight="251658240" behindDoc="0" locked="0" layoutInCell="1" allowOverlap="1" wp14:anchorId="0E8F09D9" wp14:editId="5A010C0C">
+            <wp:simplePos x="0" y="0"/>
+            <wp:positionH relativeFrom="margin">
+              <wp:posOffset>-771525</wp:posOffset>
+            </wp:positionH>
+            <wp:positionV relativeFrom="margin">
+              <wp:posOffset>-666750</wp:posOffset>
+            </wp:positionV>
+            <wp:extent cx="7400925" cy="4194810"/>
+            <wp:effectExtent l="0" t="0" r="9525" b="0"/>
+            <wp:wrapSquare wrapText="bothSides"/>
+            <wp:docPr id="715940411" name="Picture 1"/>
+            <wp:cNvGraphicFramePr>
+              <a:graphicFrameLocks xmlns:a="http://schemas.openxmlformats.org/drawingml/2006/main" noChangeAspect="1"/>
+            </wp:cNvGraphicFramePr>
+            <a:graphic xmlns:a="http://schemas.openxmlformats.org/drawingml/2006/main">
+              <a:graphicData uri="http://schemas.openxmlformats.org/drawingml/2006/picture">
+                <pic:pic xmlns:pic="http://schemas.openxmlformats.org/drawingml/2006/picture">
+                  <pic:nvPicPr>
+                    <pic:cNvPr id="715940411" name=""/>
+                    <pic:cNvPicPr/>
+                  </pic:nvPicPr>
+                  <pic:blipFill>
+                    <a:blip r:embed="rId6">
+                      <a:extLst>
+                        <a:ext uri="{28A0092B-C50C-407E-A947-70E740481C1C}">
+                          <a14:useLocalDpi xmlns:a14="http://schemas.microsoft.com/office/drawing/2010/main" val="0"/>
+                        </a:ext>
+                      </a:extLst>
+                    </a:blip>
+                    <a:stretch>
+                      <a:fillRect/>
+                    </a:stretch>
+                  </pic:blipFill>
+                  <pic:spPr>
+                    <a:xfrm>
+                      <a:off x="0" y="0"/>
+                      <a:ext cx="7400925" cy="4194810"/>
+                    </a:xfrm>
+                    <a:prstGeom prst="rect">
+                      <a:avLst/>
+                    </a:prstGeom>
+                  </pic:spPr>
+                </pic:pic>
+              </a:graphicData>
+            </a:graphic>
+          </wp:anchor>
         </w:drawing>
       </w:r>
     </w:p>
@@ -853,6 +959,7 @@
   <w:style w:type="character" w:default="1" w:styleId="DefaultParagraphFont">
     <w:name w:val="Default Paragraph Font"/>
     <w:uiPriority w:val="1"/>
+    <w:semiHidden/>
     <w:unhideWhenUsed/>
   </w:style>
   <w:style w:type="table" w:default="1" w:styleId="TableNormal">
@@ -1165,6 +1272,29 @@
       <w:smallCaps/>
       <w:color w:val="2F5496" w:themeColor="accent1" w:themeShade="BF"/>
       <w:spacing w:val="5"/>
+    </w:rPr>
+  </w:style>
+  <w:style w:type="character" w:styleId="Hyperlink">
+    <w:name w:val="Hyperlink"/>
+    <w:basedOn w:val="DefaultParagraphFont"/>
+    <w:uiPriority w:val="99"/>
+    <w:unhideWhenUsed/>
+    <w:rsid w:val="00F15FE8"/>
+    <w:rPr>
+      <w:color w:val="0563C1" w:themeColor="hyperlink"/>
+      <w:u w:val="single"/>
+    </w:rPr>
+  </w:style>
+  <w:style w:type="character" w:styleId="UnresolvedMention">
+    <w:name w:val="Unresolved Mention"/>
+    <w:basedOn w:val="DefaultParagraphFont"/>
+    <w:uiPriority w:val="99"/>
+    <w:semiHidden/>
+    <w:unhideWhenUsed/>
+    <w:rsid w:val="00F15FE8"/>
+    <w:rPr>
+      <w:color w:val="605E5C"/>
+      <w:shd w:val="clear" w:color="auto" w:fill="E1DFDD"/>
     </w:rPr>
   </w:style>
 </w:styles>

</xml_diff>